<commit_message>
Update FP 10 machine type HMI docs and services
</commit_message>
<xml_diff>
--- a/IQOQDQ/OQ_HMI/Machine type/SC 5/View_MoreView_SetupVersionInfoView.docx
+++ b/IQOQDQ/OQ_HMI/Machine type/SC 5/View_MoreView_SetupVersionInfoView.docx
@@ -43,7 +43,6 @@
             <w:pPr>
               <w:pStyle w:val="Path"/>
             </w:pPr>
-            <w:proofErr w:type="gramStart"/>
             <w:r>
               <w:t>\</w:t>
             </w:r>
@@ -53,12 +52,8 @@
             <w:r>
               <w:t>\</w:t>
             </w:r>
-            <w:proofErr w:type="gramEnd"/>
-            <w:r>
-              <w:t xml:space="preserve"> </w:t>
-            </w:r>
-            <w:r>
-              <w:t>Version display</w:t>
+            <w:r>
+              <w:t xml:space="preserve"> Version display</w:t>
             </w:r>
           </w:p>
         </w:tc>
@@ -94,10 +89,10 @@
                 <w:noProof/>
               </w:rPr>
               <w:drawing>
-                <wp:inline distT="0" distB="0" distL="0" distR="0" wp14:anchorId="51385430" wp14:editId="79029677">
-                  <wp:extent cx="5972175" cy="3357245"/>
+                <wp:inline distT="0" distB="0" distL="0" distR="0" wp14:anchorId="157F0182" wp14:editId="44699418">
+                  <wp:extent cx="5972175" cy="3358515"/>
                   <wp:effectExtent l="0" t="0" r="9525" b="0"/>
-                  <wp:docPr id="593563922" name="Picture 37"/>
+                  <wp:docPr id="877954453" name="Picture 29"/>
                   <wp:cNvGraphicFramePr>
                     <a:graphicFrameLocks xmlns:a="http://schemas.openxmlformats.org/drawingml/2006/main" noChangeAspect="1"/>
                   </wp:cNvGraphicFramePr>
@@ -105,7 +100,7 @@
                     <a:graphicData uri="http://schemas.openxmlformats.org/drawingml/2006/picture">
                       <pic:pic xmlns:pic="http://schemas.openxmlformats.org/drawingml/2006/picture">
                         <pic:nvPicPr>
-                          <pic:cNvPr id="0" name="Picture 61"/>
+                          <pic:cNvPr id="0" name="Picture 57"/>
                           <pic:cNvPicPr>
                             <a:picLocks noChangeAspect="1" noChangeArrowheads="1"/>
                           </pic:cNvPicPr>
@@ -126,7 +121,7 @@
                         <pic:spPr bwMode="auto">
                           <a:xfrm>
                             <a:off x="0" y="0"/>
-                            <a:ext cx="5972175" cy="3357245"/>
+                            <a:ext cx="5972175" cy="3358515"/>
                           </a:xfrm>
                           <a:prstGeom prst="rect">
                             <a:avLst/>
@@ -373,6 +368,888 @@
                 <w:szCs w:val="20"/>
               </w:rPr>
               <w:t xml:space="preserve"> N / A </w:t>
+            </w:r>
+          </w:p>
+        </w:tc>
+        <w:tc>
+          <w:tcPr>
+            <w:tcW w:w="1619" w:type="dxa"/>
+            <w:tcBorders>
+              <w:top w:val="nil"/>
+              <w:left w:val="nil"/>
+              <w:bottom w:val="single" w:sz="4" w:space="0" w:color="auto"/>
+              <w:right w:val="single" w:sz="4" w:space="0" w:color="auto"/>
+            </w:tcBorders>
+            <w:noWrap/>
+            <w:vAlign w:val="center"/>
+            <w:hideMark/>
+          </w:tcPr>
+          <w:p>
+            <w:pPr>
+              <w:rPr>
+                <w:rFonts w:cs="Arial"/>
+                <w:szCs w:val="20"/>
+              </w:rPr>
+            </w:pPr>
+          </w:p>
+        </w:tc>
+        <w:tc>
+          <w:tcPr>
+            <w:tcW w:w="1798" w:type="dxa"/>
+            <w:tcBorders>
+              <w:top w:val="nil"/>
+              <w:left w:val="nil"/>
+              <w:bottom w:val="single" w:sz="4" w:space="0" w:color="auto"/>
+              <w:right w:val="single" w:sz="4" w:space="0" w:color="auto"/>
+            </w:tcBorders>
+            <w:noWrap/>
+            <w:vAlign w:val="center"/>
+            <w:hideMark/>
+          </w:tcPr>
+          <w:p>
+            <w:pPr>
+              <w:rPr>
+                <w:rFonts w:cs="Arial"/>
+                <w:szCs w:val="20"/>
+              </w:rPr>
+            </w:pPr>
+          </w:p>
+        </w:tc>
+        <w:tc>
+          <w:tcPr>
+            <w:tcW w:w="1623" w:type="dxa"/>
+            <w:tcBorders>
+              <w:top w:val="nil"/>
+              <w:left w:val="nil"/>
+              <w:bottom w:val="single" w:sz="4" w:space="0" w:color="auto"/>
+              <w:right w:val="single" w:sz="4" w:space="0" w:color="auto"/>
+            </w:tcBorders>
+            <w:noWrap/>
+            <w:vAlign w:val="center"/>
+            <w:hideMark/>
+          </w:tcPr>
+          <w:p>
+            <w:pPr>
+              <w:rPr>
+                <w:rFonts w:cs="Arial"/>
+                <w:szCs w:val="20"/>
+              </w:rPr>
+            </w:pPr>
+          </w:p>
+        </w:tc>
+      </w:tr>
+    </w:tbl>
+    <w:p/>
+    <w:p>
+      <w:pPr>
+        <w:spacing w:after="160" w:line="278" w:lineRule="auto"/>
+      </w:pPr>
+      <w:r>
+        <w:br w:type="page"/>
+      </w:r>
+    </w:p>
+    <w:tbl>
+      <w:tblPr>
+        <w:tblW w:w="16037" w:type="dxa"/>
+        <w:tblInd w:w="65" w:type="dxa"/>
+        <w:tblLayout w:type="fixed"/>
+        <w:tblCellMar>
+          <w:left w:w="70" w:type="dxa"/>
+          <w:right w:w="70" w:type="dxa"/>
+        </w:tblCellMar>
+        <w:tblLook w:val="04A0" w:firstRow="1" w:lastRow="0" w:firstColumn="1" w:lastColumn="0" w:noHBand="0" w:noVBand="1"/>
+      </w:tblPr>
+      <w:tblGrid>
+        <w:gridCol w:w="4843"/>
+        <w:gridCol w:w="2722"/>
+        <w:gridCol w:w="2718"/>
+        <w:gridCol w:w="2881"/>
+        <w:gridCol w:w="2873"/>
+      </w:tblGrid>
+      <w:tr>
+        <w:trPr>
+          <w:cantSplit/>
+          <w:trHeight w:val="330"/>
+        </w:trPr>
+        <w:tc>
+          <w:tcPr>
+            <w:tcW w:w="9545" w:type="dxa"/>
+            <w:gridSpan w:val="5"/>
+            <w:tcBorders>
+              <w:top w:val="single" w:sz="4" w:space="0" w:color="auto"/>
+              <w:left w:val="single" w:sz="4" w:space="0" w:color="auto"/>
+              <w:bottom w:val="single" w:sz="4" w:space="0" w:color="auto"/>
+              <w:right w:val="single" w:sz="4" w:space="0" w:color="auto"/>
+            </w:tcBorders>
+            <w:noWrap/>
+            <w:vAlign w:val="center"/>
+          </w:tcPr>
+          <w:p>
+            <w:pPr>
+              <w:pStyle w:val="Path"/>
+            </w:pPr>
+            <w:r>
+              <w:lastRenderedPageBreak/>
+              <w:t>\(…)\Shutting down machine PC</w:t>
+            </w:r>
+          </w:p>
+        </w:tc>
+      </w:tr>
+      <w:tr>
+        <w:trPr>
+          <w:cantSplit/>
+          <w:trHeight w:val="425"/>
+        </w:trPr>
+        <w:tc>
+          <w:tcPr>
+            <w:tcW w:w="9545" w:type="dxa"/>
+            <w:gridSpan w:val="5"/>
+            <w:tcBorders>
+              <w:top w:val="single" w:sz="4" w:space="0" w:color="auto"/>
+              <w:left w:val="single" w:sz="4" w:space="0" w:color="auto"/>
+              <w:bottom w:val="single" w:sz="4" w:space="0" w:color="auto"/>
+              <w:right w:val="single" w:sz="4" w:space="0" w:color="auto"/>
+            </w:tcBorders>
+            <w:noWrap/>
+            <w:vAlign w:val="center"/>
+            <w:hideMark/>
+          </w:tcPr>
+          <w:p>
+            <w:pPr>
+              <w:rPr>
+                <w:rFonts w:cs="Arial"/>
+                <w:szCs w:val="20"/>
+              </w:rPr>
+            </w:pPr>
+            <w:r>
+              <w:rPr>
+                <w:noProof/>
+              </w:rPr>
+              <w:drawing>
+                <wp:inline distT="0" distB="0" distL="0" distR="0" wp14:anchorId="4AED4272" wp14:editId="0B1AF2FF">
+                  <wp:extent cx="4114800" cy="2640205"/>
+                  <wp:effectExtent l="0" t="0" r="0" b="8255"/>
+                  <wp:docPr id="224444167" name="Picture 1"/>
+                  <wp:cNvGraphicFramePr>
+                    <a:graphicFrameLocks xmlns:a="http://schemas.openxmlformats.org/drawingml/2006/main" noChangeAspect="1"/>
+                  </wp:cNvGraphicFramePr>
+                  <a:graphic xmlns:a="http://schemas.openxmlformats.org/drawingml/2006/main">
+                    <a:graphicData uri="http://schemas.openxmlformats.org/drawingml/2006/picture">
+                      <pic:pic xmlns:pic="http://schemas.openxmlformats.org/drawingml/2006/picture">
+                        <pic:nvPicPr>
+                          <pic:cNvPr id="0" name="Picture 12"/>
+                          <pic:cNvPicPr>
+                            <a:picLocks noChangeAspect="1" noChangeArrowheads="1"/>
+                          </pic:cNvPicPr>
+                        </pic:nvPicPr>
+                        <pic:blipFill>
+                          <a:blip r:embed="rId6">
+                            <a:extLst>
+                              <a:ext uri="{28A0092B-C50C-407E-A947-70E740481C1C}">
+                                <a14:useLocalDpi xmlns:a14="http://schemas.microsoft.com/office/drawing/2010/main" val="0"/>
+                              </a:ext>
+                            </a:extLst>
+                          </a:blip>
+                          <a:srcRect/>
+                          <a:stretch>
+                            <a:fillRect/>
+                          </a:stretch>
+                        </pic:blipFill>
+                        <pic:spPr bwMode="auto">
+                          <a:xfrm>
+                            <a:off x="0" y="0"/>
+                            <a:ext cx="4135325" cy="2653375"/>
+                          </a:xfrm>
+                          <a:prstGeom prst="rect">
+                            <a:avLst/>
+                          </a:prstGeom>
+                          <a:noFill/>
+                          <a:ln>
+                            <a:noFill/>
+                          </a:ln>
+                        </pic:spPr>
+                      </pic:pic>
+                    </a:graphicData>
+                  </a:graphic>
+                </wp:inline>
+              </w:drawing>
+            </w:r>
+            <w:r>
+              <w:rPr>
+                <w:rFonts w:cs="Tahoma"/>
+                <w:i/>
+                <w:iCs/>
+                <w:szCs w:val="25"/>
+                <w:lang w:bidi="th-TH"/>
+              </w:rPr>
+              <w:t xml:space="preserve"> E</w:t>
+            </w:r>
+            <w:r>
+              <w:rPr>
+                <w:rFonts w:cs="Arial"/>
+                <w:i/>
+                <w:iCs/>
+                <w:szCs w:val="20"/>
+              </w:rPr>
+              <w:t>xample</w:t>
+            </w:r>
+          </w:p>
+        </w:tc>
+      </w:tr>
+      <w:tr>
+        <w:trPr>
+          <w:cantSplit/>
+          <w:trHeight w:val="425"/>
+        </w:trPr>
+        <w:tc>
+          <w:tcPr>
+            <w:tcW w:w="2882" w:type="dxa"/>
+            <w:tcBorders>
+              <w:top w:val="single" w:sz="4" w:space="0" w:color="auto"/>
+              <w:left w:val="single" w:sz="4" w:space="0" w:color="auto"/>
+              <w:bottom w:val="single" w:sz="4" w:space="0" w:color="auto"/>
+              <w:right w:val="single" w:sz="4" w:space="0" w:color="auto"/>
+            </w:tcBorders>
+            <w:noWrap/>
+            <w:vAlign w:val="center"/>
+            <w:hideMark/>
+          </w:tcPr>
+          <w:p>
+            <w:pPr>
+              <w:rPr>
+                <w:rFonts w:cs="Arial"/>
+                <w:b/>
+                <w:bCs/>
+                <w:szCs w:val="20"/>
+              </w:rPr>
+            </w:pPr>
+            <w:r>
+              <w:rPr>
+                <w:rFonts w:cs="Arial"/>
+                <w:b/>
+                <w:bCs/>
+                <w:szCs w:val="20"/>
+              </w:rPr>
+              <w:t>Acceptance criterion</w:t>
+            </w:r>
+          </w:p>
+        </w:tc>
+        <w:tc>
+          <w:tcPr>
+            <w:tcW w:w="1620" w:type="dxa"/>
+            <w:tcBorders>
+              <w:top w:val="single" w:sz="4" w:space="0" w:color="auto"/>
+              <w:left w:val="single" w:sz="4" w:space="0" w:color="auto"/>
+              <w:bottom w:val="single" w:sz="4" w:space="0" w:color="auto"/>
+              <w:right w:val="single" w:sz="4" w:space="0" w:color="auto"/>
+            </w:tcBorders>
+            <w:vAlign w:val="center"/>
+          </w:tcPr>
+          <w:p>
+            <w:pPr>
+              <w:rPr>
+                <w:rFonts w:cs="Arial"/>
+                <w:b/>
+                <w:bCs/>
+                <w:szCs w:val="20"/>
+              </w:rPr>
+            </w:pPr>
+            <w:r>
+              <w:rPr>
+                <w:rFonts w:cs="Arial"/>
+                <w:b/>
+                <w:bCs/>
+                <w:szCs w:val="20"/>
+              </w:rPr>
+              <w:t>Limits</w:t>
+            </w:r>
+          </w:p>
+        </w:tc>
+        <w:tc>
+          <w:tcPr>
+            <w:tcW w:w="1618" w:type="dxa"/>
+            <w:tcBorders>
+              <w:top w:val="single" w:sz="4" w:space="0" w:color="auto"/>
+              <w:left w:val="single" w:sz="4" w:space="0" w:color="auto"/>
+              <w:bottom w:val="single" w:sz="4" w:space="0" w:color="auto"/>
+              <w:right w:val="single" w:sz="4" w:space="0" w:color="auto"/>
+            </w:tcBorders>
+            <w:vAlign w:val="center"/>
+          </w:tcPr>
+          <w:p>
+            <w:pPr>
+              <w:rPr>
+                <w:rFonts w:cs="Arial"/>
+                <w:b/>
+                <w:bCs/>
+                <w:szCs w:val="20"/>
+              </w:rPr>
+            </w:pPr>
+            <w:r>
+              <w:rPr>
+                <w:rFonts w:cs="Arial"/>
+                <w:b/>
+                <w:bCs/>
+                <w:szCs w:val="20"/>
+              </w:rPr>
+              <w:t>Pass / Fail: Dev-No.</w:t>
+            </w:r>
+          </w:p>
+        </w:tc>
+        <w:tc>
+          <w:tcPr>
+            <w:tcW w:w="1715" w:type="dxa"/>
+            <w:tcBorders>
+              <w:top w:val="single" w:sz="4" w:space="0" w:color="auto"/>
+              <w:left w:val="single" w:sz="4" w:space="0" w:color="auto"/>
+              <w:bottom w:val="single" w:sz="4" w:space="0" w:color="auto"/>
+              <w:right w:val="single" w:sz="4" w:space="0" w:color="auto"/>
+            </w:tcBorders>
+            <w:vAlign w:val="center"/>
+          </w:tcPr>
+          <w:p>
+            <w:pPr>
+              <w:rPr>
+                <w:rFonts w:cs="Arial"/>
+                <w:b/>
+                <w:bCs/>
+                <w:szCs w:val="20"/>
+              </w:rPr>
+            </w:pPr>
+            <w:r>
+              <w:rPr>
+                <w:rFonts w:cs="Arial"/>
+                <w:b/>
+                <w:bCs/>
+                <w:szCs w:val="20"/>
+              </w:rPr>
+              <w:t>Date</w:t>
+            </w:r>
+          </w:p>
+        </w:tc>
+        <w:tc>
+          <w:tcPr>
+            <w:tcW w:w="1710" w:type="dxa"/>
+            <w:tcBorders>
+              <w:top w:val="single" w:sz="4" w:space="0" w:color="auto"/>
+              <w:left w:val="single" w:sz="4" w:space="0" w:color="auto"/>
+              <w:bottom w:val="single" w:sz="4" w:space="0" w:color="auto"/>
+              <w:right w:val="single" w:sz="4" w:space="0" w:color="auto"/>
+            </w:tcBorders>
+            <w:vAlign w:val="center"/>
+          </w:tcPr>
+          <w:p>
+            <w:pPr>
+              <w:rPr>
+                <w:rFonts w:cs="Arial"/>
+                <w:b/>
+                <w:bCs/>
+                <w:szCs w:val="20"/>
+              </w:rPr>
+            </w:pPr>
+            <w:r>
+              <w:rPr>
+                <w:rFonts w:cs="Arial"/>
+                <w:b/>
+                <w:bCs/>
+                <w:szCs w:val="20"/>
+              </w:rPr>
+              <w:t>Initials</w:t>
+            </w:r>
+          </w:p>
+        </w:tc>
+      </w:tr>
+      <w:tr>
+        <w:trPr>
+          <w:cantSplit/>
+          <w:trHeight w:val="425"/>
+        </w:trPr>
+        <w:tc>
+          <w:tcPr>
+            <w:tcW w:w="2882" w:type="dxa"/>
+            <w:tcBorders>
+              <w:top w:val="nil"/>
+              <w:left w:val="single" w:sz="4" w:space="0" w:color="auto"/>
+              <w:bottom w:val="single" w:sz="4" w:space="0" w:color="auto"/>
+              <w:right w:val="single" w:sz="4" w:space="0" w:color="auto"/>
+            </w:tcBorders>
+            <w:noWrap/>
+            <w:vAlign w:val="center"/>
+            <w:hideMark/>
+          </w:tcPr>
+          <w:p>
+            <w:pPr>
+              <w:pStyle w:val="Testnummer"/>
+              <w:rPr>
+                <w:lang w:val="en-US"/>
+              </w:rPr>
+            </w:pPr>
+            <w:r>
+              <w:rPr>
+                <w:lang w:val="en-US"/>
+              </w:rPr>
+              <w:t>Screen matches screenshot</w:t>
+            </w:r>
+          </w:p>
+        </w:tc>
+        <w:tc>
+          <w:tcPr>
+            <w:tcW w:w="1620" w:type="dxa"/>
+            <w:tcBorders>
+              <w:top w:val="nil"/>
+              <w:left w:val="nil"/>
+              <w:bottom w:val="single" w:sz="4" w:space="0" w:color="auto"/>
+              <w:right w:val="single" w:sz="4" w:space="0" w:color="auto"/>
+            </w:tcBorders>
+            <w:vAlign w:val="center"/>
+            <w:hideMark/>
+          </w:tcPr>
+          <w:p>
+            <w:pPr>
+              <w:rPr>
+                <w:rFonts w:cs="Arial"/>
+                <w:szCs w:val="20"/>
+              </w:rPr>
+            </w:pPr>
+            <w:r>
+              <w:rPr>
+                <w:rFonts w:cs="Arial"/>
+                <w:szCs w:val="20"/>
+              </w:rPr>
+              <w:t xml:space="preserve">Depend of the machine </w:t>
+            </w:r>
+          </w:p>
+        </w:tc>
+        <w:tc>
+          <w:tcPr>
+            <w:tcW w:w="1618" w:type="dxa"/>
+            <w:tcBorders>
+              <w:top w:val="nil"/>
+              <w:left w:val="nil"/>
+              <w:bottom w:val="single" w:sz="4" w:space="0" w:color="auto"/>
+              <w:right w:val="single" w:sz="4" w:space="0" w:color="auto"/>
+            </w:tcBorders>
+            <w:noWrap/>
+            <w:vAlign w:val="center"/>
+            <w:hideMark/>
+          </w:tcPr>
+          <w:p>
+            <w:pPr>
+              <w:rPr>
+                <w:rFonts w:cs="Arial"/>
+                <w:szCs w:val="20"/>
+              </w:rPr>
+            </w:pPr>
+          </w:p>
+        </w:tc>
+        <w:tc>
+          <w:tcPr>
+            <w:tcW w:w="1715" w:type="dxa"/>
+            <w:tcBorders>
+              <w:top w:val="nil"/>
+              <w:left w:val="nil"/>
+              <w:bottom w:val="single" w:sz="4" w:space="0" w:color="auto"/>
+              <w:right w:val="single" w:sz="4" w:space="0" w:color="auto"/>
+            </w:tcBorders>
+            <w:noWrap/>
+            <w:vAlign w:val="center"/>
+            <w:hideMark/>
+          </w:tcPr>
+          <w:p>
+            <w:pPr>
+              <w:rPr>
+                <w:rFonts w:cs="Arial"/>
+                <w:szCs w:val="20"/>
+              </w:rPr>
+            </w:pPr>
+          </w:p>
+        </w:tc>
+        <w:tc>
+          <w:tcPr>
+            <w:tcW w:w="1710" w:type="dxa"/>
+            <w:tcBorders>
+              <w:top w:val="nil"/>
+              <w:left w:val="nil"/>
+              <w:bottom w:val="single" w:sz="4" w:space="0" w:color="auto"/>
+              <w:right w:val="single" w:sz="4" w:space="0" w:color="auto"/>
+            </w:tcBorders>
+            <w:noWrap/>
+            <w:vAlign w:val="center"/>
+            <w:hideMark/>
+          </w:tcPr>
+          <w:p>
+            <w:pPr>
+              <w:rPr>
+                <w:rFonts w:cs="Arial"/>
+                <w:szCs w:val="20"/>
+              </w:rPr>
+            </w:pPr>
+          </w:p>
+        </w:tc>
+      </w:tr>
+    </w:tbl>
+    <w:p/>
+    <w:p>
+      <w:pPr>
+        <w:spacing w:after="160" w:line="278" w:lineRule="auto"/>
+      </w:pPr>
+      <w:r>
+        <w:br w:type="page"/>
+      </w:r>
+    </w:p>
+    <w:tbl>
+      <w:tblPr>
+        <w:tblW w:w="9545" w:type="dxa"/>
+        <w:tblInd w:w="65" w:type="dxa"/>
+        <w:tblLayout w:type="fixed"/>
+        <w:tblCellMar>
+          <w:left w:w="70" w:type="dxa"/>
+          <w:right w:w="70" w:type="dxa"/>
+        </w:tblCellMar>
+        <w:tblLook w:val="04A0" w:firstRow="1" w:lastRow="0" w:firstColumn="1" w:lastColumn="0" w:noHBand="0" w:noVBand="1"/>
+      </w:tblPr>
+      <w:tblGrid>
+        <w:gridCol w:w="2886"/>
+        <w:gridCol w:w="1619"/>
+        <w:gridCol w:w="1619"/>
+        <w:gridCol w:w="1798"/>
+        <w:gridCol w:w="1623"/>
+      </w:tblGrid>
+      <w:tr>
+        <w:trPr>
+          <w:cantSplit/>
+          <w:trHeight w:val="425"/>
+        </w:trPr>
+        <w:tc>
+          <w:tcPr>
+            <w:tcW w:w="9545" w:type="dxa"/>
+            <w:gridSpan w:val="5"/>
+            <w:tcBorders>
+              <w:top w:val="single" w:sz="4" w:space="0" w:color="auto"/>
+              <w:left w:val="single" w:sz="4" w:space="0" w:color="auto"/>
+              <w:bottom w:val="single" w:sz="4" w:space="0" w:color="auto"/>
+              <w:right w:val="single" w:sz="4" w:space="0" w:color="000000"/>
+            </w:tcBorders>
+            <w:noWrap/>
+            <w:vAlign w:val="center"/>
+            <w:hideMark/>
+          </w:tcPr>
+          <w:p>
+            <w:pPr>
+              <w:pStyle w:val="Path"/>
+            </w:pPr>
+            <w:r>
+              <w:lastRenderedPageBreak/>
+              <w:t>\(…)\Touch calibration</w:t>
+            </w:r>
+          </w:p>
+        </w:tc>
+      </w:tr>
+      <w:tr>
+        <w:trPr>
+          <w:cantSplit/>
+          <w:trHeight w:val="425"/>
+        </w:trPr>
+        <w:tc>
+          <w:tcPr>
+            <w:tcW w:w="9545" w:type="dxa"/>
+            <w:gridSpan w:val="5"/>
+            <w:tcBorders>
+              <w:top w:val="single" w:sz="4" w:space="0" w:color="auto"/>
+              <w:left w:val="single" w:sz="4" w:space="0" w:color="auto"/>
+              <w:bottom w:val="single" w:sz="4" w:space="0" w:color="auto"/>
+              <w:right w:val="single" w:sz="4" w:space="0" w:color="000000"/>
+            </w:tcBorders>
+            <w:noWrap/>
+            <w:vAlign w:val="center"/>
+            <w:hideMark/>
+          </w:tcPr>
+          <w:p>
+            <w:pPr>
+              <w:rPr>
+                <w:rFonts w:cs="Arial"/>
+                <w:szCs w:val="20"/>
+              </w:rPr>
+            </w:pPr>
+            <w:r>
+              <w:rPr>
+                <w:rFonts w:cs="Arial"/>
+                <w:noProof/>
+                <w:szCs w:val="20"/>
+              </w:rPr>
+              <w:drawing>
+                <wp:inline distT="0" distB="0" distL="0" distR="0" wp14:anchorId="7E3BCE58" wp14:editId="5767FD2E">
+                  <wp:extent cx="5972175" cy="3554730"/>
+                  <wp:effectExtent l="0" t="0" r="9525" b="7620"/>
+                  <wp:docPr id="138" name="Picture 138" descr="Text, letter&#10;&#10;Description automatically generated"/>
+                  <wp:cNvGraphicFramePr>
+                    <a:graphicFrameLocks xmlns:a="http://schemas.openxmlformats.org/drawingml/2006/main" noChangeAspect="1"/>
+                  </wp:cNvGraphicFramePr>
+                  <a:graphic xmlns:a="http://schemas.openxmlformats.org/drawingml/2006/main">
+                    <a:graphicData uri="http://schemas.openxmlformats.org/drawingml/2006/picture">
+                      <pic:pic xmlns:pic="http://schemas.openxmlformats.org/drawingml/2006/picture">
+                        <pic:nvPicPr>
+                          <pic:cNvPr id="138" name="Picture 138" descr="Text, letter&#10;&#10;Description automatically generated"/>
+                          <pic:cNvPicPr/>
+                        </pic:nvPicPr>
+                        <pic:blipFill>
+                          <a:blip r:embed="rId7">
+                            <a:extLst>
+                              <a:ext uri="{28A0092B-C50C-407E-A947-70E740481C1C}">
+                                <a14:useLocalDpi xmlns:a14="http://schemas.microsoft.com/office/drawing/2010/main" val="0"/>
+                              </a:ext>
+                            </a:extLst>
+                          </a:blip>
+                          <a:stretch>
+                            <a:fillRect/>
+                          </a:stretch>
+                        </pic:blipFill>
+                        <pic:spPr>
+                          <a:xfrm>
+                            <a:off x="0" y="0"/>
+                            <a:ext cx="5972175" cy="3554730"/>
+                          </a:xfrm>
+                          <a:prstGeom prst="rect">
+                            <a:avLst/>
+                          </a:prstGeom>
+                        </pic:spPr>
+                      </pic:pic>
+                    </a:graphicData>
+                  </a:graphic>
+                </wp:inline>
+              </w:drawing>
+            </w:r>
+          </w:p>
+        </w:tc>
+      </w:tr>
+      <w:tr>
+        <w:trPr>
+          <w:cantSplit/>
+          <w:trHeight w:val="425"/>
+        </w:trPr>
+        <w:tc>
+          <w:tcPr>
+            <w:tcW w:w="2886" w:type="dxa"/>
+            <w:tcBorders>
+              <w:top w:val="nil"/>
+              <w:left w:val="single" w:sz="4" w:space="0" w:color="auto"/>
+              <w:bottom w:val="single" w:sz="4" w:space="0" w:color="auto"/>
+              <w:right w:val="single" w:sz="4" w:space="0" w:color="auto"/>
+            </w:tcBorders>
+            <w:noWrap/>
+            <w:vAlign w:val="center"/>
+            <w:hideMark/>
+          </w:tcPr>
+          <w:p>
+            <w:pPr>
+              <w:rPr>
+                <w:rFonts w:cs="Arial"/>
+                <w:b/>
+                <w:bCs/>
+                <w:szCs w:val="20"/>
+              </w:rPr>
+            </w:pPr>
+            <w:r>
+              <w:rPr>
+                <w:rFonts w:cs="Arial"/>
+                <w:b/>
+                <w:bCs/>
+                <w:szCs w:val="20"/>
+              </w:rPr>
+              <w:t>Acceptance criterion</w:t>
+            </w:r>
+          </w:p>
+        </w:tc>
+        <w:tc>
+          <w:tcPr>
+            <w:tcW w:w="1619" w:type="dxa"/>
+            <w:tcBorders>
+              <w:top w:val="nil"/>
+              <w:left w:val="nil"/>
+              <w:bottom w:val="single" w:sz="4" w:space="0" w:color="auto"/>
+              <w:right w:val="single" w:sz="4" w:space="0" w:color="auto"/>
+            </w:tcBorders>
+            <w:vAlign w:val="center"/>
+            <w:hideMark/>
+          </w:tcPr>
+          <w:p>
+            <w:pPr>
+              <w:rPr>
+                <w:rFonts w:cs="Arial"/>
+                <w:b/>
+                <w:bCs/>
+                <w:szCs w:val="20"/>
+              </w:rPr>
+            </w:pPr>
+            <w:r>
+              <w:rPr>
+                <w:rFonts w:cs="Arial"/>
+                <w:b/>
+                <w:bCs/>
+                <w:szCs w:val="20"/>
+              </w:rPr>
+              <w:t>Limits</w:t>
+            </w:r>
+          </w:p>
+        </w:tc>
+        <w:tc>
+          <w:tcPr>
+            <w:tcW w:w="1619" w:type="dxa"/>
+            <w:tcBorders>
+              <w:top w:val="nil"/>
+              <w:left w:val="nil"/>
+              <w:bottom w:val="single" w:sz="4" w:space="0" w:color="auto"/>
+              <w:right w:val="single" w:sz="4" w:space="0" w:color="auto"/>
+            </w:tcBorders>
+            <w:noWrap/>
+            <w:vAlign w:val="center"/>
+            <w:hideMark/>
+          </w:tcPr>
+          <w:p>
+            <w:pPr>
+              <w:rPr>
+                <w:rFonts w:cs="Arial"/>
+                <w:b/>
+                <w:bCs/>
+                <w:szCs w:val="20"/>
+              </w:rPr>
+            </w:pPr>
+            <w:r>
+              <w:rPr>
+                <w:rFonts w:cs="Arial"/>
+                <w:b/>
+                <w:bCs/>
+                <w:szCs w:val="20"/>
+              </w:rPr>
+              <w:t>Pass / Fail: Dev-No.</w:t>
+            </w:r>
+          </w:p>
+        </w:tc>
+        <w:tc>
+          <w:tcPr>
+            <w:tcW w:w="1798" w:type="dxa"/>
+            <w:tcBorders>
+              <w:top w:val="nil"/>
+              <w:left w:val="nil"/>
+              <w:bottom w:val="single" w:sz="4" w:space="0" w:color="auto"/>
+              <w:right w:val="single" w:sz="4" w:space="0" w:color="auto"/>
+            </w:tcBorders>
+            <w:noWrap/>
+            <w:vAlign w:val="center"/>
+            <w:hideMark/>
+          </w:tcPr>
+          <w:p>
+            <w:pPr>
+              <w:rPr>
+                <w:rFonts w:cs="Arial"/>
+                <w:b/>
+                <w:bCs/>
+                <w:szCs w:val="20"/>
+              </w:rPr>
+            </w:pPr>
+            <w:r>
+              <w:rPr>
+                <w:rFonts w:cs="Arial"/>
+                <w:b/>
+                <w:bCs/>
+                <w:szCs w:val="20"/>
+              </w:rPr>
+              <w:t>Date</w:t>
+            </w:r>
+          </w:p>
+        </w:tc>
+        <w:tc>
+          <w:tcPr>
+            <w:tcW w:w="1623" w:type="dxa"/>
+            <w:tcBorders>
+              <w:top w:val="nil"/>
+              <w:left w:val="nil"/>
+              <w:bottom w:val="single" w:sz="4" w:space="0" w:color="auto"/>
+              <w:right w:val="single" w:sz="4" w:space="0" w:color="auto"/>
+            </w:tcBorders>
+            <w:noWrap/>
+            <w:vAlign w:val="center"/>
+            <w:hideMark/>
+          </w:tcPr>
+          <w:p>
+            <w:pPr>
+              <w:rPr>
+                <w:rFonts w:cs="Arial"/>
+                <w:b/>
+                <w:bCs/>
+                <w:szCs w:val="20"/>
+              </w:rPr>
+            </w:pPr>
+            <w:r>
+              <w:rPr>
+                <w:rFonts w:cs="Arial"/>
+                <w:b/>
+                <w:bCs/>
+                <w:szCs w:val="20"/>
+              </w:rPr>
+              <w:t>Initials</w:t>
+            </w:r>
+          </w:p>
+        </w:tc>
+      </w:tr>
+      <w:tr>
+        <w:trPr>
+          <w:cantSplit/>
+          <w:trHeight w:val="425"/>
+        </w:trPr>
+        <w:tc>
+          <w:tcPr>
+            <w:tcW w:w="2886" w:type="dxa"/>
+            <w:tcBorders>
+              <w:top w:val="nil"/>
+              <w:left w:val="single" w:sz="4" w:space="0" w:color="auto"/>
+              <w:bottom w:val="single" w:sz="4" w:space="0" w:color="auto"/>
+              <w:right w:val="single" w:sz="4" w:space="0" w:color="auto"/>
+            </w:tcBorders>
+            <w:noWrap/>
+            <w:vAlign w:val="center"/>
+            <w:hideMark/>
+          </w:tcPr>
+          <w:p>
+            <w:pPr>
+              <w:pStyle w:val="Testnummer"/>
+              <w:rPr>
+                <w:lang w:val="en-US"/>
+              </w:rPr>
+            </w:pPr>
+            <w:r>
+              <w:rPr>
+                <w:lang w:val="en-US"/>
+              </w:rPr>
+              <w:t>Screen matches screenshot</w:t>
+            </w:r>
+          </w:p>
+        </w:tc>
+        <w:tc>
+          <w:tcPr>
+            <w:tcW w:w="1619" w:type="dxa"/>
+            <w:tcBorders>
+              <w:top w:val="nil"/>
+              <w:left w:val="nil"/>
+              <w:bottom w:val="single" w:sz="4" w:space="0" w:color="auto"/>
+              <w:right w:val="single" w:sz="4" w:space="0" w:color="auto"/>
+            </w:tcBorders>
+            <w:vAlign w:val="center"/>
+            <w:hideMark/>
+          </w:tcPr>
+          <w:p>
+            <w:pPr>
+              <w:rPr>
+                <w:rFonts w:cs="Arial"/>
+                <w:szCs w:val="20"/>
+              </w:rPr>
+            </w:pPr>
+            <w:r>
+              <w:rPr>
+                <w:rFonts w:cs="Arial"/>
+                <w:szCs w:val="20"/>
+              </w:rPr>
+              <w:t xml:space="preserve">Depend of the machine </w:t>
             </w:r>
           </w:p>
         </w:tc>

</xml_diff>